<commit_message>
Make portfolio URL a clickable link in resume (docx and pdf)
</commit_message>
<xml_diff>
--- a/assets/files/Avineshwar_T_Resume_ATS.docx
+++ b/assets/files/Avineshwar_T_Resume_ATS.docx
@@ -35,7 +35,13 @@
         <w:rPr>
           <w:rFonts w:ascii="Segoe UI Symbol" w:hAnsi="Segoe UI Symbol" w:cs="Segoe UI Symbol"/>
         </w:rPr>
-        <w:t xml:space="preserve">✉ </w:t>
+        <w:t>✉</w:t>
+      </w:r>
+      <w:r>
+        <w:rPr>
+          <w:rFonts w:ascii="Segoe UI Symbol" w:hAnsi="Segoe UI Symbol" w:cs="Segoe UI Symbol"/>
+        </w:rPr>
+        <w:t xml:space="preserve"> </w:t>
       </w:r>
       <w:r>
         <w:t>avinesht43@gmail.com</w:t>
@@ -47,16 +53,16 @@
         <w:jc w:val="center"/>
       </w:pPr>
       <w:r>
-        <w:t>LinkedIn: linkedin.com/in/t-</w:t>
+        <w:t xml:space="preserve">LinkedIn: linkedin.com/in/t-avineshwar | Portfolio: </w:t>
       </w:r>
-      <w:proofErr w:type="spellStart"/>
-      <w:r>
-        <w:t>avineshwar</w:t>
-      </w:r>
-      <w:proofErr w:type="spellEnd"/>
-      <w:r>
-        <w:t xml:space="preserve"> | Portfolio: avineshwar-t.github.io/avi-Portfolio</w:t>
-      </w:r>
+      <w:hyperlink r:id="rId6" w:history="1">
+        <w:r>
+          <w:rPr>
+            <w:rStyle w:val="Hyperlink"/>
+          </w:rPr>
+          <w:t>avineshwar-t.github.io/avi-Portfolio</w:t>
+        </w:r>
+      </w:hyperlink>
     </w:p>
     <w:p>
       <w:pPr>
@@ -77,7 +83,10 @@
         <w:spacing w:after="80"/>
       </w:pPr>
       <w:r>
-        <w:t>BCA graduate with hands-on experience in data analysis, data cleaning, data transformation, and dashboard development using Excel, SQL, Power BI, and Power Query. Completed a Data Visualization internship at Decodet Technologies and a Data Analytics training program at Xplore IT Corp. Developed projects involving e-commerce sales analysis, cricket statistics visualization, and retail data analysis. Seeking an entry-level Data Analyst, BI Analyst, or Reporting Analyst role to apply analytical skills and support data-driven business decisions.</w:t>
+        <w:t>BCA graduate with hands-on experience in data analysis, data cleaning, data transformation, and dashboard development using Excel, SQL, Power BI, and Power Query. Completed a Data Visualization internship at Decodet Technologies and a Data Analytics training program at Xplore IT Corp. Developed projects involving e-commerce sales analysis, cricket statistics visualization, and retail data analysis. Seeking an entry-level Data Analyst, BI Analyst, or Reporting Analyst role to apply analytical skills and supp</w:t>
+      </w:r>
+      <w:r>
+        <w:t>ort data-driven business decisions.</w:t>
       </w:r>
     </w:p>
     <w:p>
@@ -102,14 +111,7 @@
         <w:rPr>
           <w:b/>
         </w:rPr>
-        <w:t>SQL</w:t>
-      </w:r>
-      <w:proofErr w:type="gramStart"/>
-      <w:r>
-        <w:rPr>
-          <w:b/>
-        </w:rPr>
-        <w:t>:</w:t>
+        <w:t>SQL:</w:t>
       </w:r>
       <w:r>
         <w:t xml:space="preserve"> </w:t>
@@ -118,11 +120,7 @@
         <w:t xml:space="preserve"> </w:t>
       </w:r>
       <w:r>
-        <w:t>MySQL</w:t>
-      </w:r>
-      <w:proofErr w:type="gramEnd"/>
-      <w:r>
-        <w:t>, Joins, Aggregations, Subqueries, CTEs, Views, CASE Statements, Window Functions, Filtering, Ranking</w:t>
+        <w:t>MySQL, Joins, Aggregations, Subqueries, CTEs, Views, CASE Statements, Window Functions, Filtering, Ranking</w:t>
       </w:r>
     </w:p>
     <w:p>
@@ -133,14 +131,7 @@
         <w:rPr>
           <w:b/>
         </w:rPr>
-        <w:t>Power BI</w:t>
-      </w:r>
-      <w:proofErr w:type="gramStart"/>
-      <w:r>
-        <w:rPr>
-          <w:b/>
-        </w:rPr>
-        <w:t>:</w:t>
+        <w:t>Power BI:</w:t>
       </w:r>
       <w:r>
         <w:rPr>
@@ -149,11 +140,7 @@
         <w:t xml:space="preserve"> </w:t>
       </w:r>
       <w:r>
-        <w:t xml:space="preserve"> Power</w:t>
-      </w:r>
-      <w:proofErr w:type="gramEnd"/>
-      <w:r>
-        <w:t xml:space="preserve"> Query, DAX Measures, Data Modeling, KPI Reporting, Interactive Dashboards, Slicers, Drill-through</w:t>
+        <w:t xml:space="preserve"> Power Query, DAX Measures, Data Modeling, KPI Reporting, Interactive Dashboards, Slicers, Drill-through</w:t>
       </w:r>
     </w:p>
     <w:p>
@@ -164,14 +151,7 @@
         <w:rPr>
           <w:b/>
         </w:rPr>
-        <w:t>Microsoft Excel</w:t>
-      </w:r>
-      <w:proofErr w:type="gramStart"/>
-      <w:r>
-        <w:rPr>
-          <w:b/>
-        </w:rPr>
-        <w:t>:</w:t>
+        <w:t>Microsoft Excel:</w:t>
       </w:r>
       <w:r>
         <w:rPr>
@@ -180,11 +160,7 @@
         <w:t xml:space="preserve"> </w:t>
       </w:r>
       <w:r>
-        <w:t xml:space="preserve"> PivotTables</w:t>
-      </w:r>
-      <w:proofErr w:type="gramEnd"/>
-      <w:r>
-        <w:t>, Lookup Functions, Advanced Formulas, Data Cleaning, Power Query, Data Analysis</w:t>
+        <w:t xml:space="preserve"> PivotTables, Lookup Functions, Advanced Formulas, Data Cleaning, Power Query, Data Analysis</w:t>
       </w:r>
     </w:p>
     <w:p>
@@ -195,14 +171,7 @@
         <w:rPr>
           <w:b/>
         </w:rPr>
-        <w:t>Python</w:t>
-      </w:r>
-      <w:proofErr w:type="gramStart"/>
-      <w:r>
-        <w:rPr>
-          <w:b/>
-        </w:rPr>
-        <w:t>:</w:t>
+        <w:t>Python:</w:t>
       </w:r>
       <w:r>
         <w:rPr>
@@ -211,11 +180,7 @@
         <w:t xml:space="preserve"> </w:t>
       </w:r>
       <w:r>
-        <w:t xml:space="preserve"> Fundamentals</w:t>
-      </w:r>
-      <w:proofErr w:type="gramEnd"/>
-      <w:r>
-        <w:t>, Pandas, NumPy, Matplotlib, Seaborn</w:t>
+        <w:t xml:space="preserve"> Fundamentals, Pandas, NumPy, Matplotlib, Seaborn</w:t>
       </w:r>
     </w:p>
     <w:p>
@@ -226,14 +191,7 @@
         <w:rPr>
           <w:b/>
         </w:rPr>
-        <w:t>Data Analytics</w:t>
-      </w:r>
-      <w:proofErr w:type="gramStart"/>
-      <w:r>
-        <w:rPr>
-          <w:b/>
-        </w:rPr>
-        <w:t>:</w:t>
+        <w:t>Data Analytics:</w:t>
       </w:r>
       <w:r>
         <w:t xml:space="preserve"> </w:t>
@@ -244,7 +202,6 @@
       <w:r>
         <w:t>Data</w:t>
       </w:r>
-      <w:proofErr w:type="gramEnd"/>
       <w:r>
         <w:t xml:space="preserve"> Cleaning, Data Transformation, Exploratory Data Analysis, Data Visualization, Reporting, Analytical Problem-Solving</w:t>
       </w:r>
@@ -12192,6 +12149,29 @@
       </w:tcPr>
     </w:tblStylePr>
   </w:style>
+  <w:style w:type="character" w:styleId="Hyperlink">
+    <w:name w:val="Hyperlink"/>
+    <w:basedOn w:val="DefaultParagraphFont"/>
+    <w:uiPriority w:val="99"/>
+    <w:unhideWhenUsed/>
+    <w:rsid w:val="0034543F"/>
+    <w:rPr>
+      <w:color w:val="0000FF" w:themeColor="hyperlink"/>
+      <w:u w:val="single"/>
+    </w:rPr>
+  </w:style>
+  <w:style w:type="character" w:styleId="UnresolvedMention">
+    <w:name w:val="Unresolved Mention"/>
+    <w:basedOn w:val="DefaultParagraphFont"/>
+    <w:uiPriority w:val="99"/>
+    <w:semiHidden/>
+    <w:unhideWhenUsed/>
+    <w:rsid w:val="0034543F"/>
+    <w:rPr>
+      <w:color w:val="605E5C"/>
+      <w:shd w:val="clear" w:color="auto" w:fill="E1DFDD"/>
+    </w:rPr>
+  </w:style>
 </w:styles>
 </file>
 

</xml_diff>